<commit_message>
feat(observability): add ADOT logs collector
</commit_message>
<xml_diff>
--- a/docs/retail microservices applications deployed using Helm and ArgoCD.docx
+++ b/docs/retail microservices applications deployed using Helm and ArgoCD.docx
@@ -48,43 +48,15 @@
           <w:bCs/>
           <w:highlight w:val="yellow"/>
         </w:rPr>
-        <w:t xml:space="preserve"> deployed using Helm and </w:t>
-      </w:r>
-      <w:proofErr w:type="spellStart"/>
+        <w:t xml:space="preserve"> deployed using Helm and ArgoCD</w:t>
+      </w:r>
       <w:r>
         <w:rPr>
           <w:b/>
           <w:bCs/>
           <w:highlight w:val="yellow"/>
         </w:rPr>
-        <w:t>ArgoCD</w:t>
-      </w:r>
-      <w:proofErr w:type="spellEnd"/>
-      <w:r>
-        <w:rPr>
-          <w:b/>
-          <w:bCs/>
-          <w:highlight w:val="yellow"/>
-        </w:rPr>
-        <w:t xml:space="preserve">. Heathy and </w:t>
-      </w:r>
-      <w:proofErr w:type="gramStart"/>
-      <w:r>
-        <w:rPr>
-          <w:b/>
-          <w:bCs/>
-          <w:highlight w:val="yellow"/>
-        </w:rPr>
-        <w:t>Synced</w:t>
-      </w:r>
-      <w:proofErr w:type="gramEnd"/>
-      <w:r>
-        <w:rPr>
-          <w:b/>
-          <w:bCs/>
-          <w:highlight w:val="yellow"/>
-        </w:rPr>
-        <w:t>.</w:t>
+        <w:t>. Heathy and Synced.</w:t>
       </w:r>
     </w:p>
     <w:p>
@@ -102,18 +74,10 @@
     </w:p>
     <w:p>
       <w:r>
-        <w:t>1</w:t>
-      </w:r>
-      <w:proofErr w:type="gramStart"/>
-      <w:r>
-        <w:t xml:space="preserve">. </w:t>
-      </w:r>
-      <w:r>
-        <w:t xml:space="preserve"> Inspect</w:t>
-      </w:r>
-      <w:proofErr w:type="gramEnd"/>
-      <w:r>
-        <w:t xml:space="preserve"> the existing Argo CD installation and current applications. </w:t>
+        <w:t xml:space="preserve">1. </w:t>
+      </w:r>
+      <w:r>
+        <w:t xml:space="preserve"> Inspect the existing Argo CD installation and current applications. </w:t>
       </w:r>
     </w:p>
     <w:p>
@@ -121,15 +85,7 @@
         <w:t xml:space="preserve">2. </w:t>
       </w:r>
       <w:r>
-        <w:t xml:space="preserve">Create an Argo CD Application for each Helm chart: </w:t>
-      </w:r>
-      <w:proofErr w:type="spellStart"/>
-      <w:r>
-        <w:t>ui</w:t>
-      </w:r>
-      <w:proofErr w:type="spellEnd"/>
-      <w:r>
-        <w:t xml:space="preserve">, catalog, carts, checkout, and orders. </w:t>
+        <w:t xml:space="preserve">Create an Argo CD Application for each Helm chart: ui, catalog, carts, checkout, and orders. </w:t>
       </w:r>
     </w:p>
     <w:p>
@@ -161,15 +117,7 @@
         <w:t xml:space="preserve">6. </w:t>
       </w:r>
       <w:r>
-        <w:t xml:space="preserve">Test </w:t>
-      </w:r>
-      <w:proofErr w:type="spellStart"/>
-      <w:r>
-        <w:t>GitOps</w:t>
-      </w:r>
-      <w:proofErr w:type="spellEnd"/>
-      <w:r>
-        <w:t xml:space="preserve"> by changing Git and watching Argo CD reconcile EKS. </w:t>
+        <w:t xml:space="preserve">Test GitOps by changing Git and watching Argo CD reconcile EKS. </w:t>
       </w:r>
     </w:p>
     <w:p>
@@ -188,6 +136,9 @@
     </w:p>
     <w:p>
       <w:r>
+        <w:rPr>
+          <w:noProof/>
+        </w:rPr>
         <w:drawing>
           <wp:inline distT="0" distB="0" distL="0" distR="0" wp14:anchorId="536E5F7E" wp14:editId="7CA057B4">
             <wp:extent cx="5943600" cy="2037080"/>
@@ -227,6 +178,9 @@
     </w:p>
     <w:p>
       <w:r>
+        <w:rPr>
+          <w:noProof/>
+        </w:rPr>
         <w:lastRenderedPageBreak/>
         <w:drawing>
           <wp:inline distT="0" distB="0" distL="0" distR="0" wp14:anchorId="2BD4FAA1" wp14:editId="249FB627">
@@ -267,6 +221,9 @@
     </w:p>
     <w:p>
       <w:r>
+        <w:rPr>
+          <w:noProof/>
+        </w:rPr>
         <w:lastRenderedPageBreak/>
         <w:drawing>
           <wp:inline distT="0" distB="0" distL="0" distR="0" wp14:anchorId="1DD3E0F7" wp14:editId="2534F9EB">
@@ -307,6 +264,9 @@
     </w:p>
     <w:p>
       <w:r>
+        <w:rPr>
+          <w:noProof/>
+        </w:rPr>
         <w:lastRenderedPageBreak/>
         <w:drawing>
           <wp:inline distT="0" distB="0" distL="0" distR="0" wp14:anchorId="72C2AA3F" wp14:editId="310A3770">
@@ -347,6 +307,9 @@
     </w:p>
     <w:p>
       <w:r>
+        <w:rPr>
+          <w:noProof/>
+        </w:rPr>
         <w:lastRenderedPageBreak/>
         <w:drawing>
           <wp:inline distT="0" distB="0" distL="0" distR="0" wp14:anchorId="0410F0D8" wp14:editId="18F4324A">
@@ -387,6 +350,9 @@
     </w:p>
     <w:p>
       <w:r>
+        <w:rPr>
+          <w:noProof/>
+        </w:rPr>
         <w:lastRenderedPageBreak/>
         <w:drawing>
           <wp:inline distT="0" distB="0" distL="0" distR="0" wp14:anchorId="4E961D22" wp14:editId="4516A4EA">
@@ -427,6 +393,9 @@
     </w:p>
     <w:p>
       <w:r>
+        <w:rPr>
+          <w:noProof/>
+        </w:rPr>
         <w:lastRenderedPageBreak/>
         <w:drawing>
           <wp:inline distT="0" distB="0" distL="0" distR="0" wp14:anchorId="0D33D50B" wp14:editId="1880B348">
@@ -467,6 +436,9 @@
     </w:p>
     <w:p>
       <w:r>
+        <w:rPr>
+          <w:noProof/>
+        </w:rPr>
         <w:lastRenderedPageBreak/>
         <w:drawing>
           <wp:inline distT="0" distB="0" distL="0" distR="0" wp14:anchorId="32F33954" wp14:editId="0D6B826F">
@@ -508,6 +480,9 @@
     <w:p/>
     <w:p>
       <w:r>
+        <w:rPr>
+          <w:noProof/>
+        </w:rPr>
         <w:lastRenderedPageBreak/>
         <w:drawing>
           <wp:inline distT="0" distB="0" distL="0" distR="0" wp14:anchorId="4B2E108E" wp14:editId="413DEFC7">
@@ -544,6 +519,200 @@
             </a:graphic>
           </wp:inline>
         </w:drawing>
+      </w:r>
+    </w:p>
+    <w:p/>
+    <w:p/>
+    <w:p>
+      <w:r>
+        <w:lastRenderedPageBreak/>
+        <w:drawing>
+          <wp:inline distT="0" distB="0" distL="0" distR="0" wp14:anchorId="00B0B495" wp14:editId="0C4A51C2">
+            <wp:extent cx="5943600" cy="5401310"/>
+            <wp:effectExtent l="0" t="0" r="0" b="8890"/>
+            <wp:docPr id="293189745" name="Picture 1"/>
+            <wp:cNvGraphicFramePr>
+              <a:graphicFrameLocks xmlns:a="http://schemas.openxmlformats.org/drawingml/2006/main" noChangeAspect="1"/>
+            </wp:cNvGraphicFramePr>
+            <a:graphic xmlns:a="http://schemas.openxmlformats.org/drawingml/2006/main">
+              <a:graphicData uri="http://schemas.openxmlformats.org/drawingml/2006/picture">
+                <pic:pic xmlns:pic="http://schemas.openxmlformats.org/drawingml/2006/picture">
+                  <pic:nvPicPr>
+                    <pic:cNvPr id="293189745" name=""/>
+                    <pic:cNvPicPr/>
+                  </pic:nvPicPr>
+                  <pic:blipFill>
+                    <a:blip r:embed="rId13"/>
+                    <a:stretch>
+                      <a:fillRect/>
+                    </a:stretch>
+                  </pic:blipFill>
+                  <pic:spPr>
+                    <a:xfrm>
+                      <a:off x="0" y="0"/>
+                      <a:ext cx="5943600" cy="5401310"/>
+                    </a:xfrm>
+                    <a:prstGeom prst="rect">
+                      <a:avLst/>
+                    </a:prstGeom>
+                  </pic:spPr>
+                </pic:pic>
+              </a:graphicData>
+            </a:graphic>
+          </wp:inline>
+        </w:drawing>
+      </w:r>
+    </w:p>
+    <w:p>
+      <w:r>
+        <w:t xml:space="preserve">                    GitHub</w:t>
+      </w:r>
+    </w:p>
+    <w:p>
+      <w:r>
+        <w:t xml:space="preserve">                       │</w:t>
+      </w:r>
+    </w:p>
+    <w:p>
+      <w:r>
+        <w:t xml:space="preserve">                  GitHub Actions</w:t>
+      </w:r>
+    </w:p>
+    <w:p>
+      <w:r>
+        <w:t xml:space="preserve">                       │</w:t>
+      </w:r>
+    </w:p>
+    <w:p>
+      <w:r>
+        <w:t xml:space="preserve">                       </w:t>
+      </w:r>
+      <w:r>
+        <w:rPr>
+          <w:rFonts w:ascii="Arial" w:hAnsi="Arial" w:cs="Arial"/>
+        </w:rPr>
+        <w:t>▼</w:t>
+      </w:r>
+    </w:p>
+    <w:p>
+      <w:r>
+        <w:t xml:space="preserve">                  Argo CD GitOps</w:t>
+      </w:r>
+    </w:p>
+    <w:p>
+      <w:r>
+        <w:t xml:space="preserve">                       │</w:t>
+      </w:r>
+    </w:p>
+    <w:p>
+      <w:r>
+        <w:t xml:space="preserve">     ┌─────────────────</w:t>
+      </w:r>
+      <w:r>
+        <w:rPr>
+          <w:rFonts w:ascii="MS Gothic" w:eastAsia="MS Gothic" w:hAnsi="MS Gothic" w:cs="MS Gothic" w:hint="eastAsia"/>
+        </w:rPr>
+        <w:t>┼</w:t>
+      </w:r>
+      <w:r>
+        <w:rPr>
+          <w:rFonts w:ascii="Aptos" w:hAnsi="Aptos" w:cs="Aptos"/>
+        </w:rPr>
+        <w:t>──────────────────┐</w:t>
+      </w:r>
+    </w:p>
+    <w:p>
+      <w:r>
+        <w:lastRenderedPageBreak/>
+        <w:t xml:space="preserve">     │                 │                  │</w:t>
+      </w:r>
+    </w:p>
+    <w:p>
+      <w:r>
+        <w:t xml:space="preserve"> Helm Apps       Kustomize OTel      Rollouts</w:t>
+      </w:r>
+    </w:p>
+    <w:p>
+      <w:r>
+        <w:t xml:space="preserve">     │               </w:t>
+      </w:r>
+      <w:r>
+        <w:tab/>
+      </w:r>
+      <w:r>
+        <w:tab/>
+      </w:r>
+      <w:r>
+        <w:t xml:space="preserve">│                  </w:t>
+      </w:r>
+      <w:r>
+        <w:tab/>
+      </w:r>
+      <w:r>
+        <w:t>│</w:t>
+      </w:r>
+    </w:p>
+    <w:p>
+      <w:r>
+        <w:t xml:space="preserve">     </w:t>
+      </w:r>
+      <w:r>
+        <w:rPr>
+          <w:rFonts w:ascii="Arial" w:hAnsi="Arial" w:cs="Arial"/>
+        </w:rPr>
+        <w:t>▼</w:t>
+      </w:r>
+      <w:r>
+        <w:t xml:space="preserve">                 </w:t>
+      </w:r>
+      <w:r>
+        <w:tab/>
+      </w:r>
+      <w:r>
+        <w:tab/>
+      </w:r>
+      <w:r>
+        <w:rPr>
+          <w:rFonts w:ascii="Arial" w:hAnsi="Arial" w:cs="Arial"/>
+        </w:rPr>
+        <w:t>▼</w:t>
+      </w:r>
+      <w:r>
+        <w:t xml:space="preserve">                  </w:t>
+      </w:r>
+      <w:r>
+        <w:tab/>
+      </w:r>
+      <w:r>
+        <w:rPr>
+          <w:rFonts w:ascii="Arial" w:hAnsi="Arial" w:cs="Arial"/>
+        </w:rPr>
+        <w:t>▼</w:t>
+      </w:r>
+    </w:p>
+    <w:p>
+      <w:r>
+        <w:t xml:space="preserve"> Catalog        OpenTelemetry      Canary Releases</w:t>
+      </w:r>
+    </w:p>
+    <w:p>
+      <w:r>
+        <w:t xml:space="preserve"> Orders         Collector</w:t>
+      </w:r>
+    </w:p>
+    <w:p>
+      <w:r>
+        <w:t xml:space="preserve"> Checkout       Instrumentation</w:t>
+      </w:r>
+    </w:p>
+    <w:p>
+      <w:r>
+        <w:t xml:space="preserve"> UI</w:t>
+      </w:r>
+    </w:p>
+    <w:p>
+      <w:r>
+        <w:t xml:space="preserve"> Carts</w:t>
       </w:r>
     </w:p>
     <w:sectPr>
@@ -1159,6 +1328,7 @@
   <w:style w:type="character" w:default="1" w:styleId="DefaultParagraphFont">
     <w:name w:val="Default Paragraph Font"/>
     <w:uiPriority w:val="1"/>
+    <w:semiHidden/>
     <w:unhideWhenUsed/>
   </w:style>
   <w:style w:type="table" w:default="1" w:styleId="TableNormal">

</xml_diff>